<commit_message>
week 6 Networking and APIs
</commit_message>
<xml_diff>
--- a/docss/Log book book hub.docx
+++ b/docss/Log book book hub.docx
@@ -648,6 +648,32 @@
           <w:szCs w:val="26"/>
         </w:rPr>
       </w:pPr>
+      <w:r>
+        <w:rPr>
+          <w:rFonts w:ascii="Times New Roman" w:eastAsia="Times New Roman" w:hAnsi="Times New Roman" w:cs="Times New Roman"/>
+          <w:sz w:val="26"/>
+          <w:szCs w:val="26"/>
+        </w:rPr>
+        <w:t xml:space="preserve">WEEK 1 REFLECTION: </w:t>
+      </w:r>
+      <w:r>
+        <w:rPr>
+          <w:rFonts w:ascii="Times New Roman" w:eastAsia="Times New Roman" w:hAnsi="Times New Roman" w:cs="Times New Roman"/>
+          <w:sz w:val="26"/>
+          <w:szCs w:val="26"/>
+        </w:rPr>
+        <w:t>Installing Visual Studio Code was a valuable learning experience that enhanced my software development environment. I learned how to download, install, and configure the application successfully. The process improved my understanding of development tools and their importance in coding, debugging, and managing projects efficiently and effectively.</w:t>
+      </w:r>
+    </w:p>
+    <w:p>
+      <w:pPr>
+        <w:spacing w:before="280" w:after="280" w:line="240" w:lineRule="auto"/>
+        <w:rPr>
+          <w:rFonts w:ascii="Times New Roman" w:eastAsia="Times New Roman" w:hAnsi="Times New Roman" w:cs="Times New Roman"/>
+          <w:sz w:val="26"/>
+          <w:szCs w:val="26"/>
+        </w:rPr>
+      </w:pPr>
     </w:p>
     <w:p>
       <w:pPr>
@@ -723,7 +749,6 @@
           <w:b/>
           <w:bCs/>
         </w:rPr>
-        <w:lastRenderedPageBreak/>
         <w:t>Week 2: Screen Display</w:t>
       </w:r>
     </w:p>
@@ -843,114 +868,208 @@
     </w:p>
     <w:p>
       <w:pPr>
-        <w:pStyle w:val="Heading3"/>
-        <w:rPr>
-          <w:b/>
-          <w:bCs/>
-        </w:rPr>
-      </w:pPr>
+        <w:shd w:val="clear" w:color="auto" w:fill="FFFFFF"/>
+        <w:spacing w:after="160"/>
+        <w:rPr>
+          <w:b/>
+          <w:bCs/>
+        </w:rPr>
+      </w:pPr>
+      <w:r>
+        <w:rPr>
+          <w:noProof/>
+        </w:rPr>
+        <w:lastRenderedPageBreak/>
+        <w:drawing>
+          <wp:inline distT="0" distB="0" distL="0" distR="0" wp14:anchorId="4B900238" wp14:editId="388439CF">
+            <wp:extent cx="1898650" cy="3327400"/>
+            <wp:effectExtent l="0" t="0" r="6350" b="6350"/>
+            <wp:docPr id="304839067" name="Picture 1"/>
+            <wp:cNvGraphicFramePr>
+              <a:graphicFrameLocks xmlns:a="http://schemas.openxmlformats.org/drawingml/2006/main" noChangeAspect="1"/>
+            </wp:cNvGraphicFramePr>
+            <a:graphic xmlns:a="http://schemas.openxmlformats.org/drawingml/2006/main">
+              <a:graphicData uri="http://schemas.openxmlformats.org/drawingml/2006/picture">
+                <pic:pic xmlns:pic="http://schemas.openxmlformats.org/drawingml/2006/picture">
+                  <pic:nvPicPr>
+                    <pic:cNvPr id="0" name="Picture 1"/>
+                    <pic:cNvPicPr>
+                      <a:picLocks noChangeAspect="1" noChangeArrowheads="1"/>
+                    </pic:cNvPicPr>
+                  </pic:nvPicPr>
+                  <pic:blipFill>
+                    <a:blip r:embed="rId6" cstate="print">
+                      <a:extLst>
+                        <a:ext uri="{28A0092B-C50C-407E-A947-70E740481C1C}">
+                          <a14:useLocalDpi xmlns:a14="http://schemas.microsoft.com/office/drawing/2010/main" val="0"/>
+                        </a:ext>
+                      </a:extLst>
+                    </a:blip>
+                    <a:srcRect/>
+                    <a:stretch>
+                      <a:fillRect/>
+                    </a:stretch>
+                  </pic:blipFill>
+                  <pic:spPr bwMode="auto">
+                    <a:xfrm>
+                      <a:off x="0" y="0"/>
+                      <a:ext cx="1899692" cy="3329226"/>
+                    </a:xfrm>
+                    <a:prstGeom prst="rect">
+                      <a:avLst/>
+                    </a:prstGeom>
+                    <a:noFill/>
+                    <a:ln>
+                      <a:noFill/>
+                    </a:ln>
+                  </pic:spPr>
+                </pic:pic>
+              </a:graphicData>
+            </a:graphic>
+          </wp:inline>
+        </w:drawing>
+      </w:r>
       <w:bookmarkStart w:id="10" w:name="_rffdrvvwy8rk" w:colFirst="0" w:colLast="0"/>
+      <w:bookmarkStart w:id="11" w:name="_gzkjq0dlot2m" w:colFirst="0" w:colLast="0"/>
+      <w:bookmarkStart w:id="12" w:name="_tfo9qdo1w48p" w:colFirst="0" w:colLast="0"/>
+      <w:bookmarkStart w:id="13" w:name="_10kg9z314tac" w:colFirst="0" w:colLast="0"/>
+      <w:bookmarkStart w:id="14" w:name="_btkmdz3trvao" w:colFirst="0" w:colLast="0"/>
+      <w:bookmarkStart w:id="15" w:name="_4to7zuhneurz" w:colFirst="0" w:colLast="0"/>
+      <w:bookmarkStart w:id="16" w:name="_mc2jhq1wmehe" w:colFirst="0" w:colLast="0"/>
+      <w:bookmarkStart w:id="17" w:name="_5itlpz4dg0k6" w:colFirst="0" w:colLast="0"/>
       <w:bookmarkEnd w:id="10"/>
-    </w:p>
-    <w:p>
-      <w:pPr>
-        <w:pStyle w:val="Heading3"/>
-        <w:rPr>
-          <w:b/>
-          <w:bCs/>
-        </w:rPr>
-      </w:pPr>
-      <w:bookmarkStart w:id="11" w:name="_gzkjq0dlot2m" w:colFirst="0" w:colLast="0"/>
       <w:bookmarkEnd w:id="11"/>
-    </w:p>
-    <w:p>
-      <w:pPr>
-        <w:pStyle w:val="Heading3"/>
-        <w:rPr>
-          <w:b/>
-          <w:bCs/>
-        </w:rPr>
-      </w:pPr>
-      <w:bookmarkStart w:id="12" w:name="_tfo9qdo1w48p" w:colFirst="0" w:colLast="0"/>
       <w:bookmarkEnd w:id="12"/>
-    </w:p>
-    <w:p>
-      <w:pPr>
-        <w:pStyle w:val="Heading3"/>
-        <w:rPr>
-          <w:b/>
-          <w:bCs/>
-        </w:rPr>
-      </w:pPr>
-      <w:bookmarkStart w:id="13" w:name="_10kg9z314tac" w:colFirst="0" w:colLast="0"/>
       <w:bookmarkEnd w:id="13"/>
-    </w:p>
-    <w:p>
-      <w:pPr>
-        <w:pStyle w:val="Heading3"/>
-        <w:rPr>
-          <w:b/>
-          <w:bCs/>
-        </w:rPr>
-      </w:pPr>
-      <w:bookmarkStart w:id="14" w:name="_btkmdz3trvao" w:colFirst="0" w:colLast="0"/>
       <w:bookmarkEnd w:id="14"/>
-    </w:p>
-    <w:p>
-      <w:pPr>
-        <w:pStyle w:val="Heading3"/>
-        <w:rPr>
-          <w:b/>
-          <w:bCs/>
-        </w:rPr>
-      </w:pPr>
-      <w:bookmarkStart w:id="15" w:name="_4to7zuhneurz" w:colFirst="0" w:colLast="0"/>
       <w:bookmarkEnd w:id="15"/>
-    </w:p>
-    <w:p>
-      <w:pPr>
-        <w:pStyle w:val="Heading3"/>
-        <w:rPr>
-          <w:b/>
-          <w:bCs/>
-        </w:rPr>
-      </w:pPr>
-      <w:bookmarkStart w:id="16" w:name="_mc2jhq1wmehe" w:colFirst="0" w:colLast="0"/>
       <w:bookmarkEnd w:id="16"/>
-    </w:p>
-    <w:p>
-      <w:pPr>
-        <w:rPr>
-          <w:rFonts w:ascii="Times New Roman" w:eastAsia="Times New Roman" w:hAnsi="Times New Roman" w:cs="Times New Roman"/>
-        </w:rPr>
-      </w:pPr>
-    </w:p>
-    <w:p>
-      <w:pPr>
-        <w:rPr>
-          <w:rFonts w:ascii="Times New Roman" w:eastAsia="Times New Roman" w:hAnsi="Times New Roman" w:cs="Times New Roman"/>
-        </w:rPr>
-      </w:pPr>
-    </w:p>
-    <w:p>
-      <w:pPr>
-        <w:rPr>
-          <w:rFonts w:ascii="Times New Roman" w:eastAsia="Times New Roman" w:hAnsi="Times New Roman" w:cs="Times New Roman"/>
-        </w:rPr>
-      </w:pPr>
-    </w:p>
-    <w:p>
-      <w:pPr>
-        <w:pStyle w:val="Heading3"/>
-      </w:pPr>
-      <w:bookmarkStart w:id="17" w:name="_5itlpz4dg0k6" w:colFirst="0" w:colLast="0"/>
       <w:bookmarkEnd w:id="17"/>
-      <w:r>
-        <w:rPr>
-          <w:b/>
-          <w:bCs/>
-        </w:rPr>
-        <w:lastRenderedPageBreak/>
+    </w:p>
+    <w:p>
+      <w:pPr>
+        <w:shd w:val="clear" w:color="auto" w:fill="FFFFFF"/>
+        <w:tabs>
+          <w:tab w:val="left" w:pos="3310"/>
+        </w:tabs>
+        <w:spacing w:after="160"/>
+        <w:rPr>
+          <w:b/>
+          <w:bCs/>
+        </w:rPr>
+      </w:pPr>
+    </w:p>
+    <w:p>
+      <w:pPr>
+        <w:shd w:val="clear" w:color="auto" w:fill="FFFFFF"/>
+        <w:tabs>
+          <w:tab w:val="left" w:pos="3310"/>
+        </w:tabs>
+        <w:spacing w:after="160"/>
+      </w:pPr>
+      <w:r>
+        <w:rPr>
+          <w:b/>
+          <w:bCs/>
+        </w:rPr>
+        <w:t xml:space="preserve">WEEK </w:t>
+      </w:r>
+      <w:proofErr w:type="gramStart"/>
+      <w:r>
+        <w:rPr>
+          <w:b/>
+          <w:bCs/>
+        </w:rPr>
+        <w:t>2  REFLECTION</w:t>
+      </w:r>
+      <w:proofErr w:type="gramEnd"/>
+      <w:r>
+        <w:rPr>
+          <w:b/>
+          <w:bCs/>
+        </w:rPr>
+        <w:t>:</w:t>
+      </w:r>
+      <w:r>
+        <w:rPr>
+          <w:b/>
+          <w:bCs/>
+        </w:rPr>
+        <w:tab/>
+      </w:r>
+      <w:r>
+        <w:rPr>
+          <w:b/>
+          <w:bCs/>
+        </w:rPr>
+        <w:t>Through this practical, I learned the fundamentals of mobile application development using Android Studio and Kotlin. I gained experience in creating projects, understanding the development environment, and building a simple Hello World application. The exercise improved my confidence in mobile app development and prepared me for more advanced tasks.</w:t>
+      </w:r>
+    </w:p>
+    <w:p>
+      <w:pPr>
+        <w:shd w:val="clear" w:color="auto" w:fill="FFFFFF"/>
+        <w:spacing w:after="160"/>
+        <w:rPr>
+          <w:b/>
+          <w:bCs/>
+        </w:rPr>
+      </w:pPr>
+    </w:p>
+    <w:p>
+      <w:pPr>
+        <w:shd w:val="clear" w:color="auto" w:fill="FFFFFF"/>
+        <w:spacing w:after="160"/>
+        <w:rPr>
+          <w:b/>
+          <w:bCs/>
+        </w:rPr>
+      </w:pPr>
+    </w:p>
+    <w:p>
+      <w:pPr>
+        <w:shd w:val="clear" w:color="auto" w:fill="FFFFFF"/>
+        <w:spacing w:after="160"/>
+        <w:rPr>
+          <w:b/>
+          <w:bCs/>
+        </w:rPr>
+      </w:pPr>
+    </w:p>
+    <w:p>
+      <w:pPr>
+        <w:shd w:val="clear" w:color="auto" w:fill="FFFFFF"/>
+        <w:spacing w:after="160"/>
+        <w:rPr>
+          <w:b/>
+          <w:bCs/>
+        </w:rPr>
+      </w:pPr>
+    </w:p>
+    <w:p>
+      <w:pPr>
+        <w:shd w:val="clear" w:color="auto" w:fill="FFFFFF"/>
+        <w:spacing w:after="160"/>
+        <w:rPr>
+          <w:b/>
+          <w:bCs/>
+        </w:rPr>
+      </w:pPr>
+    </w:p>
+    <w:p>
+      <w:pPr>
+        <w:shd w:val="clear" w:color="auto" w:fill="FFFFFF"/>
+        <w:spacing w:after="160"/>
+        <w:rPr>
+          <w:rFonts w:ascii="Times New Roman" w:eastAsia="Times New Roman" w:hAnsi="Times New Roman" w:cs="Times New Roman"/>
+          <w:sz w:val="24"/>
+          <w:szCs w:val="24"/>
+        </w:rPr>
+      </w:pPr>
+      <w:r>
+        <w:rPr>
+          <w:b/>
+          <w:bCs/>
+        </w:rPr>
         <w:t>Week 3: Wireframes and GUI Design</w:t>
       </w:r>
       <w:r>
@@ -1010,6 +1129,7 @@
           <w:rFonts w:ascii="Times New Roman" w:eastAsia="Times New Roman" w:hAnsi="Times New Roman" w:cs="Times New Roman"/>
           <w:noProof/>
         </w:rPr>
+        <w:lastRenderedPageBreak/>
         <w:drawing>
           <wp:inline distT="0" distB="0" distL="0" distR="0" wp14:anchorId="5012B915" wp14:editId="5B45A296">
             <wp:extent cx="3949700" cy="5105400"/>
@@ -1026,7 +1146,7 @@
                     <pic:cNvPicPr/>
                   </pic:nvPicPr>
                   <pic:blipFill>
-                    <a:blip r:embed="rId6">
+                    <a:blip r:embed="rId7">
                       <a:extLst>
                         <a:ext uri="{28A0092B-C50C-407E-A947-70E740481C1C}">
                           <a14:useLocalDpi xmlns:a14="http://schemas.microsoft.com/office/drawing/2010/main" val="0"/>
@@ -1071,21 +1191,34 @@
       <w:pPr>
         <w:rPr>
           <w:rFonts w:ascii="Times New Roman" w:eastAsia="Times New Roman" w:hAnsi="Times New Roman" w:cs="Times New Roman"/>
-          <w:b/>
-          <w:bCs/>
-          <w:sz w:val="24"/>
-          <w:szCs w:val="24"/>
-        </w:rPr>
-      </w:pPr>
-    </w:p>
-    <w:p>
-      <w:pPr>
-        <w:rPr>
-          <w:rFonts w:ascii="Times New Roman" w:eastAsia="Times New Roman" w:hAnsi="Times New Roman" w:cs="Times New Roman"/>
-          <w:b/>
-          <w:bCs/>
-          <w:sz w:val="24"/>
-          <w:szCs w:val="24"/>
+        </w:rPr>
+      </w:pPr>
+    </w:p>
+    <w:p>
+      <w:pPr>
+        <w:rPr>
+          <w:rFonts w:ascii="Times New Roman" w:eastAsia="Times New Roman" w:hAnsi="Times New Roman" w:cs="Times New Roman"/>
+        </w:rPr>
+      </w:pPr>
+    </w:p>
+    <w:p>
+      <w:pPr>
+        <w:rPr>
+          <w:rFonts w:ascii="Times New Roman" w:eastAsia="Times New Roman" w:hAnsi="Times New Roman" w:cs="Times New Roman"/>
+        </w:rPr>
+      </w:pPr>
+    </w:p>
+    <w:p>
+      <w:pPr>
+        <w:rPr>
+          <w:rFonts w:ascii="Times New Roman" w:eastAsia="Times New Roman" w:hAnsi="Times New Roman" w:cs="Times New Roman"/>
+        </w:rPr>
+      </w:pPr>
+    </w:p>
+    <w:p>
+      <w:pPr>
+        <w:rPr>
+          <w:rFonts w:ascii="Times New Roman" w:eastAsia="Times New Roman" w:hAnsi="Times New Roman" w:cs="Times New Roman"/>
         </w:rPr>
       </w:pPr>
     </w:p>
@@ -1169,6 +1302,42 @@
           <w:szCs w:val="24"/>
         </w:rPr>
       </w:pPr>
+    </w:p>
+    <w:p>
+      <w:pPr>
+        <w:rPr>
+          <w:rFonts w:ascii="Times New Roman" w:eastAsia="Times New Roman" w:hAnsi="Times New Roman" w:cs="Times New Roman"/>
+          <w:sz w:val="24"/>
+          <w:szCs w:val="24"/>
+        </w:rPr>
+      </w:pPr>
+    </w:p>
+    <w:p>
+      <w:pPr>
+        <w:rPr>
+          <w:rFonts w:ascii="Times New Roman" w:eastAsia="Times New Roman" w:hAnsi="Times New Roman" w:cs="Times New Roman"/>
+          <w:sz w:val="24"/>
+          <w:szCs w:val="24"/>
+        </w:rPr>
+      </w:pPr>
+    </w:p>
+    <w:p>
+      <w:pPr>
+        <w:rPr>
+          <w:rFonts w:ascii="Times New Roman" w:eastAsia="Times New Roman" w:hAnsi="Times New Roman" w:cs="Times New Roman"/>
+          <w:sz w:val="24"/>
+          <w:szCs w:val="24"/>
+        </w:rPr>
+      </w:pPr>
+    </w:p>
+    <w:p>
+      <w:pPr>
+        <w:rPr>
+          <w:rFonts w:ascii="Times New Roman" w:eastAsia="Times New Roman" w:hAnsi="Times New Roman" w:cs="Times New Roman"/>
+          <w:sz w:val="24"/>
+          <w:szCs w:val="24"/>
+        </w:rPr>
+      </w:pPr>
       <w:r>
         <w:rPr>
           <w:rFonts w:ascii="Times New Roman" w:eastAsia="Times New Roman" w:hAnsi="Times New Roman" w:cs="Times New Roman"/>
@@ -1176,7 +1345,6 @@
           <w:sz w:val="24"/>
           <w:szCs w:val="24"/>
         </w:rPr>
-        <w:lastRenderedPageBreak/>
         <w:drawing>
           <wp:inline distT="0" distB="0" distL="0" distR="0" wp14:anchorId="11233595" wp14:editId="6363D632">
             <wp:extent cx="4051300" cy="5172075"/>
@@ -1193,7 +1361,7 @@
                     <pic:cNvPicPr/>
                   </pic:nvPicPr>
                   <pic:blipFill>
-                    <a:blip r:embed="rId7">
+                    <a:blip r:embed="rId8">
                       <a:extLst>
                         <a:ext uri="{28A0092B-C50C-407E-A947-70E740481C1C}">
                           <a14:useLocalDpi xmlns:a14="http://schemas.microsoft.com/office/drawing/2010/main" val="0"/>
@@ -1224,59 +1392,98 @@
       <w:pPr>
         <w:rPr>
           <w:rFonts w:ascii="Times New Roman" w:eastAsia="Times New Roman" w:hAnsi="Times New Roman" w:cs="Times New Roman"/>
-          <w:sz w:val="24"/>
-          <w:szCs w:val="24"/>
-        </w:rPr>
-      </w:pPr>
-    </w:p>
-    <w:p>
-      <w:pPr>
-        <w:rPr>
-          <w:rFonts w:ascii="Times New Roman" w:eastAsia="Times New Roman" w:hAnsi="Times New Roman" w:cs="Times New Roman"/>
-          <w:sz w:val="24"/>
-          <w:szCs w:val="24"/>
-        </w:rPr>
-      </w:pPr>
-    </w:p>
-    <w:p>
-      <w:pPr>
-        <w:rPr>
-          <w:rFonts w:ascii="Times New Roman" w:eastAsia="Times New Roman" w:hAnsi="Times New Roman" w:cs="Times New Roman"/>
-        </w:rPr>
-      </w:pPr>
-    </w:p>
-    <w:p>
-      <w:pPr>
-        <w:rPr>
-          <w:rFonts w:ascii="Times New Roman" w:eastAsia="Times New Roman" w:hAnsi="Times New Roman" w:cs="Times New Roman"/>
-        </w:rPr>
-      </w:pPr>
-    </w:p>
-    <w:p>
-      <w:pPr>
-        <w:rPr>
-          <w:rFonts w:ascii="Times New Roman" w:eastAsia="Times New Roman" w:hAnsi="Times New Roman" w:cs="Times New Roman"/>
-        </w:rPr>
-      </w:pPr>
-    </w:p>
-    <w:p>
-      <w:pPr>
-        <w:rPr>
-          <w:rFonts w:ascii="Times New Roman" w:eastAsia="Times New Roman" w:hAnsi="Times New Roman" w:cs="Times New Roman"/>
-        </w:rPr>
-      </w:pPr>
-    </w:p>
-    <w:p>
-      <w:pPr>
-        <w:rPr>
-          <w:rFonts w:ascii="Times New Roman" w:eastAsia="Times New Roman" w:hAnsi="Times New Roman" w:cs="Times New Roman"/>
-        </w:rPr>
-      </w:pPr>
-    </w:p>
-    <w:p>
-      <w:pPr>
-        <w:rPr>
-          <w:rFonts w:ascii="Times New Roman" w:eastAsia="Times New Roman" w:hAnsi="Times New Roman" w:cs="Times New Roman"/>
+          <w:b/>
+          <w:bCs/>
+          <w:sz w:val="24"/>
+          <w:szCs w:val="24"/>
+        </w:rPr>
+      </w:pPr>
+    </w:p>
+    <w:p>
+      <w:pPr>
+        <w:rPr>
+          <w:rFonts w:ascii="Times New Roman" w:eastAsia="Times New Roman" w:hAnsi="Times New Roman" w:cs="Times New Roman"/>
+          <w:b/>
+          <w:bCs/>
+          <w:sz w:val="24"/>
+          <w:szCs w:val="24"/>
+        </w:rPr>
+      </w:pPr>
+    </w:p>
+    <w:p>
+      <w:pPr>
+        <w:rPr>
+          <w:rFonts w:ascii="Times New Roman" w:eastAsia="Times New Roman" w:hAnsi="Times New Roman" w:cs="Times New Roman"/>
+          <w:b/>
+          <w:bCs/>
+          <w:sz w:val="24"/>
+          <w:szCs w:val="24"/>
+        </w:rPr>
+      </w:pPr>
+    </w:p>
+    <w:p>
+      <w:pPr>
+        <w:rPr>
+          <w:rFonts w:ascii="Times New Roman" w:eastAsia="Times New Roman" w:hAnsi="Times New Roman" w:cs="Times New Roman"/>
+          <w:b/>
+          <w:bCs/>
+          <w:sz w:val="24"/>
+          <w:szCs w:val="24"/>
+        </w:rPr>
+      </w:pPr>
+    </w:p>
+    <w:p>
+      <w:pPr>
+        <w:rPr>
+          <w:rFonts w:ascii="Times New Roman" w:eastAsia="Times New Roman" w:hAnsi="Times New Roman" w:cs="Times New Roman"/>
+          <w:b/>
+          <w:bCs/>
+          <w:sz w:val="24"/>
+          <w:szCs w:val="24"/>
+        </w:rPr>
+      </w:pPr>
+    </w:p>
+    <w:p>
+      <w:pPr>
+        <w:rPr>
+          <w:rFonts w:ascii="Times New Roman" w:eastAsia="Times New Roman" w:hAnsi="Times New Roman" w:cs="Times New Roman"/>
+          <w:b/>
+          <w:bCs/>
+          <w:sz w:val="24"/>
+          <w:szCs w:val="24"/>
+        </w:rPr>
+      </w:pPr>
+    </w:p>
+    <w:p>
+      <w:pPr>
+        <w:rPr>
+          <w:rFonts w:ascii="Times New Roman" w:eastAsia="Times New Roman" w:hAnsi="Times New Roman" w:cs="Times New Roman"/>
+          <w:b/>
+          <w:bCs/>
+          <w:sz w:val="24"/>
+          <w:szCs w:val="24"/>
+        </w:rPr>
+      </w:pPr>
+    </w:p>
+    <w:p>
+      <w:pPr>
+        <w:rPr>
+          <w:rFonts w:ascii="Times New Roman" w:eastAsia="Times New Roman" w:hAnsi="Times New Roman" w:cs="Times New Roman"/>
+          <w:b/>
+          <w:bCs/>
+          <w:sz w:val="24"/>
+          <w:szCs w:val="24"/>
+        </w:rPr>
+      </w:pPr>
+    </w:p>
+    <w:p>
+      <w:pPr>
+        <w:rPr>
+          <w:rFonts w:ascii="Times New Roman" w:eastAsia="Times New Roman" w:hAnsi="Times New Roman" w:cs="Times New Roman"/>
+          <w:b/>
+          <w:bCs/>
+          <w:sz w:val="24"/>
+          <w:szCs w:val="24"/>
         </w:rPr>
       </w:pPr>
     </w:p>
@@ -1304,7 +1511,23 @@
           <w:sz w:val="24"/>
           <w:szCs w:val="24"/>
         </w:rPr>
-        <w:t xml:space="preserve"> Place list</w:t>
+        <w:t xml:space="preserve"> Place </w:t>
+      </w:r>
+      <w:r>
+        <w:rPr>
+          <w:rFonts w:ascii="Times New Roman" w:eastAsia="Times New Roman" w:hAnsi="Times New Roman" w:cs="Times New Roman"/>
+          <w:sz w:val="24"/>
+          <w:szCs w:val="24"/>
+        </w:rPr>
+        <w:t xml:space="preserve">book </w:t>
+      </w:r>
+      <w:r>
+        <w:rPr>
+          <w:rFonts w:ascii="Times New Roman" w:eastAsia="Times New Roman" w:hAnsi="Times New Roman" w:cs="Times New Roman"/>
+          <w:sz w:val="24"/>
+          <w:szCs w:val="24"/>
+        </w:rPr>
+        <w:t>list</w:t>
       </w:r>
     </w:p>
     <w:p>
@@ -1360,9 +1583,9 @@
         </w:rPr>
         <w:lastRenderedPageBreak/>
         <w:drawing>
-          <wp:inline distT="0" distB="0" distL="0" distR="0" wp14:anchorId="31A9B4E8" wp14:editId="3EB088E8">
-            <wp:extent cx="3981450" cy="4457700"/>
-            <wp:effectExtent l="0" t="0" r="0" b="0"/>
+          <wp:inline distT="0" distB="0" distL="0" distR="0" wp14:anchorId="31A9B4E8" wp14:editId="17D17513">
+            <wp:extent cx="3422650" cy="3784600"/>
+            <wp:effectExtent l="0" t="0" r="6350" b="6350"/>
             <wp:docPr id="1711595068" name="Picture 6"/>
             <wp:cNvGraphicFramePr>
               <a:graphicFrameLocks xmlns:a="http://schemas.openxmlformats.org/drawingml/2006/main" noChangeAspect="1"/>
@@ -1372,161 +1595,6 @@
                 <pic:pic xmlns:pic="http://schemas.openxmlformats.org/drawingml/2006/picture">
                   <pic:nvPicPr>
                     <pic:cNvPr id="1711595068" name="Picture 1711595068"/>
-                    <pic:cNvPicPr/>
-                  </pic:nvPicPr>
-                  <pic:blipFill>
-                    <a:blip r:embed="rId8">
-                      <a:extLst>
-                        <a:ext uri="{28A0092B-C50C-407E-A947-70E740481C1C}">
-                          <a14:useLocalDpi xmlns:a14="http://schemas.microsoft.com/office/drawing/2010/main" val="0"/>
-                        </a:ext>
-                      </a:extLst>
-                    </a:blip>
-                    <a:stretch>
-                      <a:fillRect/>
-                    </a:stretch>
-                  </pic:blipFill>
-                  <pic:spPr>
-                    <a:xfrm>
-                      <a:off x="0" y="0"/>
-                      <a:ext cx="3981450" cy="4457700"/>
-                    </a:xfrm>
-                    <a:prstGeom prst="rect">
-                      <a:avLst/>
-                    </a:prstGeom>
-                  </pic:spPr>
-                </pic:pic>
-              </a:graphicData>
-            </a:graphic>
-          </wp:inline>
-        </w:drawing>
-      </w:r>
-    </w:p>
-    <w:p>
-      <w:pPr>
-        <w:rPr>
-          <w:rFonts w:ascii="Times New Roman" w:eastAsia="Times New Roman" w:hAnsi="Times New Roman" w:cs="Times New Roman"/>
-        </w:rPr>
-      </w:pPr>
-    </w:p>
-    <w:p>
-      <w:pPr>
-        <w:rPr>
-          <w:rFonts w:ascii="Times New Roman" w:eastAsia="Times New Roman" w:hAnsi="Times New Roman" w:cs="Times New Roman"/>
-        </w:rPr>
-      </w:pPr>
-    </w:p>
-    <w:p>
-      <w:pPr>
-        <w:rPr>
-          <w:rFonts w:ascii="Times New Roman" w:eastAsia="Times New Roman" w:hAnsi="Times New Roman" w:cs="Times New Roman"/>
-        </w:rPr>
-      </w:pPr>
-    </w:p>
-    <w:p>
-      <w:pPr>
-        <w:rPr>
-          <w:rFonts w:ascii="Times New Roman" w:eastAsia="Times New Roman" w:hAnsi="Times New Roman" w:cs="Times New Roman"/>
-        </w:rPr>
-      </w:pPr>
-    </w:p>
-    <w:p>
-      <w:pPr>
-        <w:rPr>
-          <w:rFonts w:ascii="Times New Roman" w:eastAsia="Times New Roman" w:hAnsi="Times New Roman" w:cs="Times New Roman"/>
-        </w:rPr>
-      </w:pPr>
-    </w:p>
-    <w:p>
-      <w:pPr>
-        <w:rPr>
-          <w:rFonts w:ascii="Times New Roman" w:eastAsia="Times New Roman" w:hAnsi="Times New Roman" w:cs="Times New Roman"/>
-        </w:rPr>
-      </w:pPr>
-    </w:p>
-    <w:p>
-      <w:pPr>
-        <w:rPr>
-          <w:rFonts w:ascii="Times New Roman" w:eastAsia="Times New Roman" w:hAnsi="Times New Roman" w:cs="Times New Roman"/>
-          <w:sz w:val="24"/>
-          <w:szCs w:val="24"/>
-        </w:rPr>
-      </w:pPr>
-      <w:r>
-        <w:rPr>
-          <w:rFonts w:ascii="Times New Roman" w:eastAsia="Times New Roman" w:hAnsi="Times New Roman" w:cs="Times New Roman"/>
-          <w:b/>
-          <w:bCs/>
-          <w:sz w:val="24"/>
-          <w:szCs w:val="24"/>
-        </w:rPr>
-        <w:t xml:space="preserve">Figure 3.4: </w:t>
-      </w:r>
-      <w:r>
-        <w:rPr>
-          <w:rFonts w:ascii="Times New Roman" w:eastAsia="Times New Roman" w:hAnsi="Times New Roman" w:cs="Times New Roman"/>
-          <w:sz w:val="24"/>
-          <w:szCs w:val="24"/>
-        </w:rPr>
-        <w:t>Place details</w:t>
-      </w:r>
-    </w:p>
-    <w:p>
-      <w:pPr>
-        <w:rPr>
-          <w:rFonts w:ascii="Times New Roman" w:eastAsia="Times New Roman" w:hAnsi="Times New Roman" w:cs="Times New Roman"/>
-          <w:sz w:val="24"/>
-          <w:szCs w:val="24"/>
-        </w:rPr>
-      </w:pPr>
-    </w:p>
-    <w:p>
-      <w:pPr>
-        <w:rPr>
-          <w:rFonts w:ascii="Times New Roman" w:eastAsia="Times New Roman" w:hAnsi="Times New Roman" w:cs="Times New Roman"/>
-          <w:sz w:val="24"/>
-          <w:szCs w:val="24"/>
-        </w:rPr>
-      </w:pPr>
-    </w:p>
-    <w:p>
-      <w:pPr>
-        <w:rPr>
-          <w:rFonts w:ascii="Times New Roman" w:eastAsia="Times New Roman" w:hAnsi="Times New Roman" w:cs="Times New Roman"/>
-          <w:sz w:val="24"/>
-          <w:szCs w:val="24"/>
-        </w:rPr>
-      </w:pPr>
-    </w:p>
-    <w:p>
-      <w:pPr>
-        <w:rPr>
-          <w:rFonts w:ascii="Times New Roman" w:eastAsia="Times New Roman" w:hAnsi="Times New Roman" w:cs="Times New Roman"/>
-          <w:sz w:val="24"/>
-          <w:szCs w:val="24"/>
-        </w:rPr>
-      </w:pPr>
-      <w:r>
-        <w:rPr>
-          <w:rFonts w:ascii="Times New Roman" w:eastAsia="Times New Roman" w:hAnsi="Times New Roman" w:cs="Times New Roman"/>
-          <w:noProof/>
-          <w:sz w:val="24"/>
-          <w:szCs w:val="24"/>
-        </w:rPr>
-        <w:lastRenderedPageBreak/>
-        <w:drawing>
-          <wp:inline distT="0" distB="0" distL="0" distR="0" wp14:anchorId="6B860986" wp14:editId="47535980">
-            <wp:extent cx="3930650" cy="4667250"/>
-            <wp:effectExtent l="0" t="0" r="0" b="0"/>
-            <wp:docPr id="364551701" name="Picture 7"/>
-            <wp:cNvGraphicFramePr>
-              <a:graphicFrameLocks xmlns:a="http://schemas.openxmlformats.org/drawingml/2006/main" noChangeAspect="1"/>
-            </wp:cNvGraphicFramePr>
-            <a:graphic xmlns:a="http://schemas.openxmlformats.org/drawingml/2006/main">
-              <a:graphicData uri="http://schemas.openxmlformats.org/drawingml/2006/picture">
-                <pic:pic xmlns:pic="http://schemas.openxmlformats.org/drawingml/2006/picture">
-                  <pic:nvPicPr>
-                    <pic:cNvPr id="364551701" name="Picture 364551701"/>
                     <pic:cNvPicPr/>
                   </pic:nvPicPr>
                   <pic:blipFill>
@@ -1544,7 +1612,237 @@
                   <pic:spPr>
                     <a:xfrm>
                       <a:off x="0" y="0"/>
-                      <a:ext cx="3930650" cy="4667250"/>
+                      <a:ext cx="3422650" cy="3784600"/>
+                    </a:xfrm>
+                    <a:prstGeom prst="rect">
+                      <a:avLst/>
+                    </a:prstGeom>
+                  </pic:spPr>
+                </pic:pic>
+              </a:graphicData>
+            </a:graphic>
+          </wp:inline>
+        </w:drawing>
+      </w:r>
+    </w:p>
+    <w:p>
+      <w:pPr>
+        <w:rPr>
+          <w:rFonts w:ascii="Times New Roman" w:eastAsia="Times New Roman" w:hAnsi="Times New Roman" w:cs="Times New Roman"/>
+        </w:rPr>
+      </w:pPr>
+    </w:p>
+    <w:p>
+      <w:pPr>
+        <w:rPr>
+          <w:rFonts w:ascii="Times New Roman" w:eastAsia="Times New Roman" w:hAnsi="Times New Roman" w:cs="Times New Roman"/>
+          <w:b/>
+          <w:bCs/>
+          <w:sz w:val="24"/>
+          <w:szCs w:val="24"/>
+        </w:rPr>
+      </w:pPr>
+    </w:p>
+    <w:p>
+      <w:pPr>
+        <w:rPr>
+          <w:rFonts w:ascii="Times New Roman" w:eastAsia="Times New Roman" w:hAnsi="Times New Roman" w:cs="Times New Roman"/>
+          <w:b/>
+          <w:bCs/>
+          <w:sz w:val="24"/>
+          <w:szCs w:val="24"/>
+        </w:rPr>
+      </w:pPr>
+    </w:p>
+    <w:p>
+      <w:pPr>
+        <w:rPr>
+          <w:rFonts w:ascii="Times New Roman" w:eastAsia="Times New Roman" w:hAnsi="Times New Roman" w:cs="Times New Roman"/>
+          <w:b/>
+          <w:bCs/>
+          <w:sz w:val="24"/>
+          <w:szCs w:val="24"/>
+        </w:rPr>
+      </w:pPr>
+    </w:p>
+    <w:p>
+      <w:pPr>
+        <w:rPr>
+          <w:rFonts w:ascii="Times New Roman" w:eastAsia="Times New Roman" w:hAnsi="Times New Roman" w:cs="Times New Roman"/>
+          <w:b/>
+          <w:bCs/>
+          <w:sz w:val="24"/>
+          <w:szCs w:val="24"/>
+        </w:rPr>
+      </w:pPr>
+    </w:p>
+    <w:p>
+      <w:pPr>
+        <w:rPr>
+          <w:rFonts w:ascii="Times New Roman" w:eastAsia="Times New Roman" w:hAnsi="Times New Roman" w:cs="Times New Roman"/>
+          <w:b/>
+          <w:bCs/>
+          <w:sz w:val="24"/>
+          <w:szCs w:val="24"/>
+        </w:rPr>
+      </w:pPr>
+    </w:p>
+    <w:p>
+      <w:pPr>
+        <w:rPr>
+          <w:rFonts w:ascii="Times New Roman" w:eastAsia="Times New Roman" w:hAnsi="Times New Roman" w:cs="Times New Roman"/>
+          <w:b/>
+          <w:bCs/>
+          <w:sz w:val="24"/>
+          <w:szCs w:val="24"/>
+        </w:rPr>
+      </w:pPr>
+    </w:p>
+    <w:p>
+      <w:pPr>
+        <w:rPr>
+          <w:rFonts w:ascii="Times New Roman" w:eastAsia="Times New Roman" w:hAnsi="Times New Roman" w:cs="Times New Roman"/>
+          <w:b/>
+          <w:bCs/>
+          <w:sz w:val="24"/>
+          <w:szCs w:val="24"/>
+        </w:rPr>
+      </w:pPr>
+    </w:p>
+    <w:p>
+      <w:pPr>
+        <w:rPr>
+          <w:rFonts w:ascii="Times New Roman" w:eastAsia="Times New Roman" w:hAnsi="Times New Roman" w:cs="Times New Roman"/>
+          <w:b/>
+          <w:bCs/>
+          <w:sz w:val="24"/>
+          <w:szCs w:val="24"/>
+        </w:rPr>
+      </w:pPr>
+    </w:p>
+    <w:p>
+      <w:pPr>
+        <w:rPr>
+          <w:rFonts w:ascii="Times New Roman" w:eastAsia="Times New Roman" w:hAnsi="Times New Roman" w:cs="Times New Roman"/>
+          <w:b/>
+          <w:bCs/>
+          <w:sz w:val="24"/>
+          <w:szCs w:val="24"/>
+        </w:rPr>
+      </w:pPr>
+    </w:p>
+    <w:p>
+      <w:pPr>
+        <w:rPr>
+          <w:rFonts w:ascii="Times New Roman" w:eastAsia="Times New Roman" w:hAnsi="Times New Roman" w:cs="Times New Roman"/>
+          <w:b/>
+          <w:bCs/>
+          <w:sz w:val="24"/>
+          <w:szCs w:val="24"/>
+        </w:rPr>
+      </w:pPr>
+    </w:p>
+    <w:p>
+      <w:pPr>
+        <w:rPr>
+          <w:rFonts w:ascii="Times New Roman" w:eastAsia="Times New Roman" w:hAnsi="Times New Roman" w:cs="Times New Roman"/>
+          <w:sz w:val="24"/>
+          <w:szCs w:val="24"/>
+        </w:rPr>
+      </w:pPr>
+      <w:r>
+        <w:rPr>
+          <w:rFonts w:ascii="Times New Roman" w:eastAsia="Times New Roman" w:hAnsi="Times New Roman" w:cs="Times New Roman"/>
+          <w:b/>
+          <w:bCs/>
+          <w:sz w:val="24"/>
+          <w:szCs w:val="24"/>
+        </w:rPr>
+        <w:t xml:space="preserve">Figure 3.4: </w:t>
+      </w:r>
+      <w:r>
+        <w:rPr>
+          <w:rFonts w:ascii="Times New Roman" w:eastAsia="Times New Roman" w:hAnsi="Times New Roman" w:cs="Times New Roman"/>
+          <w:sz w:val="24"/>
+          <w:szCs w:val="24"/>
+        </w:rPr>
+        <w:t>Place details</w:t>
+      </w:r>
+    </w:p>
+    <w:p>
+      <w:pPr>
+        <w:rPr>
+          <w:rFonts w:ascii="Times New Roman" w:eastAsia="Times New Roman" w:hAnsi="Times New Roman" w:cs="Times New Roman"/>
+          <w:sz w:val="24"/>
+          <w:szCs w:val="24"/>
+        </w:rPr>
+      </w:pPr>
+    </w:p>
+    <w:p>
+      <w:pPr>
+        <w:rPr>
+          <w:rFonts w:ascii="Times New Roman" w:eastAsia="Times New Roman" w:hAnsi="Times New Roman" w:cs="Times New Roman"/>
+          <w:sz w:val="24"/>
+          <w:szCs w:val="24"/>
+        </w:rPr>
+      </w:pPr>
+    </w:p>
+    <w:p>
+      <w:pPr>
+        <w:rPr>
+          <w:rFonts w:ascii="Times New Roman" w:eastAsia="Times New Roman" w:hAnsi="Times New Roman" w:cs="Times New Roman"/>
+          <w:sz w:val="24"/>
+          <w:szCs w:val="24"/>
+        </w:rPr>
+      </w:pPr>
+    </w:p>
+    <w:p>
+      <w:pPr>
+        <w:rPr>
+          <w:rFonts w:ascii="Times New Roman" w:eastAsia="Times New Roman" w:hAnsi="Times New Roman" w:cs="Times New Roman"/>
+          <w:sz w:val="24"/>
+          <w:szCs w:val="24"/>
+        </w:rPr>
+      </w:pPr>
+      <w:r>
+        <w:rPr>
+          <w:rFonts w:ascii="Times New Roman" w:eastAsia="Times New Roman" w:hAnsi="Times New Roman" w:cs="Times New Roman"/>
+          <w:noProof/>
+          <w:sz w:val="24"/>
+          <w:szCs w:val="24"/>
+        </w:rPr>
+        <w:lastRenderedPageBreak/>
+        <w:drawing>
+          <wp:inline distT="0" distB="0" distL="0" distR="0" wp14:anchorId="6B860986" wp14:editId="05455EAD">
+            <wp:extent cx="3314700" cy="4667250"/>
+            <wp:effectExtent l="0" t="0" r="0" b="0"/>
+            <wp:docPr id="364551701" name="Picture 7"/>
+            <wp:cNvGraphicFramePr>
+              <a:graphicFrameLocks xmlns:a="http://schemas.openxmlformats.org/drawingml/2006/main" noChangeAspect="1"/>
+            </wp:cNvGraphicFramePr>
+            <a:graphic xmlns:a="http://schemas.openxmlformats.org/drawingml/2006/main">
+              <a:graphicData uri="http://schemas.openxmlformats.org/drawingml/2006/picture">
+                <pic:pic xmlns:pic="http://schemas.openxmlformats.org/drawingml/2006/picture">
+                  <pic:nvPicPr>
+                    <pic:cNvPr id="364551701" name="Picture 364551701"/>
+                    <pic:cNvPicPr/>
+                  </pic:nvPicPr>
+                  <pic:blipFill>
+                    <a:blip r:embed="rId10">
+                      <a:extLst>
+                        <a:ext uri="{28A0092B-C50C-407E-A947-70E740481C1C}">
+                          <a14:useLocalDpi xmlns:a14="http://schemas.microsoft.com/office/drawing/2010/main" val="0"/>
+                        </a:ext>
+                      </a:extLst>
+                    </a:blip>
+                    <a:stretch>
+                      <a:fillRect/>
+                    </a:stretch>
+                  </pic:blipFill>
+                  <pic:spPr>
+                    <a:xfrm>
+                      <a:off x="0" y="0"/>
+                      <a:ext cx="3314700" cy="4667250"/>
                     </a:xfrm>
                     <a:prstGeom prst="rect">
                       <a:avLst/>
@@ -1669,7 +1967,7 @@
                     </pic:cNvPicPr>
                   </pic:nvPicPr>
                   <pic:blipFill>
-                    <a:blip r:embed="rId10">
+                    <a:blip r:embed="rId11">
                       <a:extLst>
                         <a:ext uri="{28A0092B-C50C-407E-A947-70E740481C1C}">
                           <a14:useLocalDpi xmlns:a14="http://schemas.microsoft.com/office/drawing/2010/main" val="0"/>
@@ -1721,6 +2019,168 @@
           <w:rFonts w:ascii="Times New Roman" w:eastAsia="Times New Roman" w:hAnsi="Times New Roman" w:cs="Times New Roman"/>
         </w:rPr>
       </w:pPr>
+    </w:p>
+    <w:p>
+      <w:pPr>
+        <w:rPr>
+          <w:rFonts w:ascii="Times New Roman" w:eastAsia="Times New Roman" w:hAnsi="Times New Roman" w:cs="Times New Roman"/>
+        </w:rPr>
+      </w:pPr>
+    </w:p>
+    <w:p>
+      <w:pPr>
+        <w:rPr>
+          <w:rFonts w:ascii="Times New Roman" w:eastAsia="Times New Roman" w:hAnsi="Times New Roman" w:cs="Times New Roman"/>
+        </w:rPr>
+      </w:pPr>
+    </w:p>
+    <w:p>
+      <w:pPr>
+        <w:rPr>
+          <w:rFonts w:ascii="Times New Roman" w:eastAsia="Times New Roman" w:hAnsi="Times New Roman" w:cs="Times New Roman"/>
+        </w:rPr>
+      </w:pPr>
+    </w:p>
+    <w:p>
+      <w:pPr>
+        <w:rPr>
+          <w:rFonts w:ascii="Times New Roman" w:eastAsia="Times New Roman" w:hAnsi="Times New Roman" w:cs="Times New Roman"/>
+        </w:rPr>
+      </w:pPr>
+    </w:p>
+    <w:p>
+      <w:pPr>
+        <w:rPr>
+          <w:rFonts w:ascii="Times New Roman" w:eastAsia="Times New Roman" w:hAnsi="Times New Roman" w:cs="Times New Roman"/>
+        </w:rPr>
+      </w:pPr>
+    </w:p>
+    <w:p>
+      <w:pPr>
+        <w:rPr>
+          <w:rFonts w:ascii="Times New Roman" w:eastAsia="Times New Roman" w:hAnsi="Times New Roman" w:cs="Times New Roman"/>
+        </w:rPr>
+      </w:pPr>
+      <w:r>
+        <w:rPr>
+          <w:rFonts w:ascii="Times New Roman" w:eastAsia="Times New Roman" w:hAnsi="Times New Roman" w:cs="Times New Roman"/>
+        </w:rPr>
+        <w:t>WEEK 3 REFLECTION:</w:t>
+      </w:r>
+      <w:r>
+        <w:t xml:space="preserve"> </w:t>
+      </w:r>
+      <w:r>
+        <w:rPr>
+          <w:rFonts w:ascii="Times New Roman" w:eastAsia="Times New Roman" w:hAnsi="Times New Roman" w:cs="Times New Roman"/>
+        </w:rPr>
+        <w:t xml:space="preserve">The wireframes provided a clear visual blueprint for the </w:t>
+      </w:r>
+      <w:proofErr w:type="spellStart"/>
+      <w:r>
+        <w:rPr>
+          <w:rFonts w:ascii="Times New Roman" w:eastAsia="Times New Roman" w:hAnsi="Times New Roman" w:cs="Times New Roman"/>
+        </w:rPr>
+        <w:t>SetBook</w:t>
+      </w:r>
+      <w:proofErr w:type="spellEnd"/>
+      <w:r>
+        <w:rPr>
+          <w:rFonts w:ascii="Times New Roman" w:eastAsia="Times New Roman" w:hAnsi="Times New Roman" w:cs="Times New Roman"/>
+        </w:rPr>
+        <w:t xml:space="preserve"> Hub application. They helped define the user journey, screen layouts, navigation flow, and core features before development. Creating the wireframes improved understanding of user requirements, identified design improvements early, and ensured consistency across all screens, reducing development errors and rework.</w:t>
+      </w:r>
+    </w:p>
+    <w:p>
+      <w:pPr>
+        <w:rPr>
+          <w:rFonts w:ascii="Times New Roman" w:eastAsia="Times New Roman" w:hAnsi="Times New Roman" w:cs="Times New Roman"/>
+        </w:rPr>
+      </w:pPr>
+    </w:p>
+    <w:p>
+      <w:pPr>
+        <w:rPr>
+          <w:rFonts w:ascii="Times New Roman" w:eastAsia="Times New Roman" w:hAnsi="Times New Roman" w:cs="Times New Roman"/>
+        </w:rPr>
+      </w:pPr>
+    </w:p>
+    <w:p>
+      <w:pPr>
+        <w:rPr>
+          <w:rFonts w:ascii="Times New Roman" w:eastAsia="Times New Roman" w:hAnsi="Times New Roman" w:cs="Times New Roman"/>
+        </w:rPr>
+      </w:pPr>
+    </w:p>
+    <w:p>
+      <w:pPr>
+        <w:rPr>
+          <w:rFonts w:ascii="Times New Roman" w:eastAsia="Times New Roman" w:hAnsi="Times New Roman" w:cs="Times New Roman"/>
+        </w:rPr>
+      </w:pPr>
+    </w:p>
+    <w:p>
+      <w:pPr>
+        <w:rPr>
+          <w:rFonts w:ascii="Times New Roman" w:eastAsia="Times New Roman" w:hAnsi="Times New Roman" w:cs="Times New Roman"/>
+        </w:rPr>
+      </w:pPr>
+    </w:p>
+    <w:p>
+      <w:pPr>
+        <w:rPr>
+          <w:rFonts w:ascii="Times New Roman" w:eastAsia="Times New Roman" w:hAnsi="Times New Roman" w:cs="Times New Roman"/>
+        </w:rPr>
+      </w:pPr>
+    </w:p>
+    <w:p>
+      <w:pPr>
+        <w:rPr>
+          <w:rFonts w:ascii="Times New Roman" w:eastAsia="Times New Roman" w:hAnsi="Times New Roman" w:cs="Times New Roman"/>
+        </w:rPr>
+      </w:pPr>
+    </w:p>
+    <w:p>
+      <w:pPr>
+        <w:rPr>
+          <w:rFonts w:ascii="Times New Roman" w:eastAsia="Times New Roman" w:hAnsi="Times New Roman" w:cs="Times New Roman"/>
+        </w:rPr>
+      </w:pPr>
+    </w:p>
+    <w:p>
+      <w:pPr>
+        <w:rPr>
+          <w:rFonts w:ascii="Times New Roman" w:eastAsia="Times New Roman" w:hAnsi="Times New Roman" w:cs="Times New Roman"/>
+        </w:rPr>
+      </w:pPr>
+    </w:p>
+    <w:p>
+      <w:pPr>
+        <w:rPr>
+          <w:rFonts w:ascii="Times New Roman" w:eastAsia="Times New Roman" w:hAnsi="Times New Roman" w:cs="Times New Roman"/>
+        </w:rPr>
+      </w:pPr>
+    </w:p>
+    <w:p>
+      <w:pPr>
+        <w:rPr>
+          <w:rFonts w:ascii="Times New Roman" w:eastAsia="Times New Roman" w:hAnsi="Times New Roman" w:cs="Times New Roman"/>
+        </w:rPr>
+      </w:pPr>
+    </w:p>
+    <w:p>
+      <w:pPr>
+        <w:rPr>
+          <w:rFonts w:ascii="Times New Roman" w:eastAsia="Times New Roman" w:hAnsi="Times New Roman" w:cs="Times New Roman"/>
+        </w:rPr>
+      </w:pPr>
+    </w:p>
+    <w:p>
+      <w:pPr>
+        <w:rPr>
+          <w:rFonts w:ascii="Times New Roman" w:eastAsia="Times New Roman" w:hAnsi="Times New Roman" w:cs="Times New Roman"/>
+        </w:rPr>
+      </w:pPr>
       <w:r>
         <w:rPr>
           <w:rFonts w:ascii="Times New Roman" w:eastAsia="Times New Roman" w:hAnsi="Times New Roman" w:cs="Times New Roman"/>
@@ -1757,7 +2217,6 @@
         <w:rPr>
           <w:noProof/>
         </w:rPr>
-        <w:lastRenderedPageBreak/>
         <w:drawing>
           <wp:inline distT="0" distB="0" distL="0" distR="0" wp14:anchorId="7FAAB7FC" wp14:editId="3008316C">
             <wp:extent cx="2988839" cy="2673350"/>
@@ -1776,7 +2235,7 @@
                     </pic:cNvPicPr>
                   </pic:nvPicPr>
                   <pic:blipFill>
-                    <a:blip r:embed="rId11">
+                    <a:blip r:embed="rId12">
                       <a:extLst>
                         <a:ext uri="{28A0092B-C50C-407E-A947-70E740481C1C}">
                           <a14:useLocalDpi xmlns:a14="http://schemas.microsoft.com/office/drawing/2010/main" val="0"/>
@@ -1818,6 +2277,40 @@
         <w:rPr>
           <w:rFonts w:ascii="Times New Roman" w:eastAsia="Times New Roman" w:hAnsi="Times New Roman" w:cs="Times New Roman"/>
         </w:rPr>
+        <w:t xml:space="preserve">User Authentication Gatekeeping: By introducing a login screen, you are transitioning your application from a public viewer to a personalized experience. This is the first step toward handling user sessions, access </w:t>
+      </w:r>
+      <w:proofErr w:type="gramStart"/>
+      <w:r>
+        <w:rPr>
+          <w:rFonts w:ascii="Times New Roman" w:eastAsia="Times New Roman" w:hAnsi="Times New Roman" w:cs="Times New Roman"/>
+        </w:rPr>
+        <w:t>tokens  and</w:t>
+      </w:r>
+      <w:proofErr w:type="gramEnd"/>
+      <w:r>
+        <w:rPr>
+          <w:rFonts w:ascii="Times New Roman" w:eastAsia="Times New Roman" w:hAnsi="Times New Roman" w:cs="Times New Roman"/>
+        </w:rPr>
+        <w:t xml:space="preserve"> user-specific data storage.</w:t>
+      </w:r>
+    </w:p>
+    <w:p>
+      <w:pPr>
+        <w:rPr>
+          <w:rFonts w:ascii="Times New Roman" w:eastAsia="Times New Roman" w:hAnsi="Times New Roman" w:cs="Times New Roman"/>
+        </w:rPr>
+      </w:pPr>
+    </w:p>
+    <w:p>
+      <w:pPr>
+        <w:rPr>
+          <w:rFonts w:ascii="Times New Roman" w:eastAsia="Times New Roman" w:hAnsi="Times New Roman" w:cs="Times New Roman"/>
+        </w:rPr>
+      </w:pPr>
+      <w:r>
+        <w:rPr>
+          <w:rFonts w:ascii="Times New Roman" w:eastAsia="Times New Roman" w:hAnsi="Times New Roman" w:cs="Times New Roman"/>
+        </w:rPr>
         <w:t>FIGURE3.6 REGISTRATION</w:t>
       </w:r>
     </w:p>
@@ -1831,11 +2324,12 @@
         <w:rPr>
           <w:noProof/>
         </w:rPr>
+        <w:lastRenderedPageBreak/>
         <w:drawing>
-          <wp:inline distT="0" distB="0" distL="0" distR="0" wp14:anchorId="61A0949A" wp14:editId="18ABFA03">
-            <wp:extent cx="4337050" cy="4239895"/>
-            <wp:effectExtent l="0" t="0" r="6350" b="8255"/>
-            <wp:docPr id="1914590340" name="Picture 7"/>
+          <wp:inline distT="0" distB="0" distL="0" distR="0" wp14:anchorId="5921073C" wp14:editId="5D251DE4">
+            <wp:extent cx="3155909" cy="4533900"/>
+            <wp:effectExtent l="0" t="0" r="6985" b="0"/>
+            <wp:docPr id="1065083338" name="Picture 2"/>
             <wp:cNvGraphicFramePr>
               <a:graphicFrameLocks xmlns:a="http://schemas.openxmlformats.org/drawingml/2006/main" noChangeAspect="1"/>
             </wp:cNvGraphicFramePr>
@@ -1843,13 +2337,13 @@
               <a:graphicData uri="http://schemas.openxmlformats.org/drawingml/2006/picture">
                 <pic:pic xmlns:pic="http://schemas.openxmlformats.org/drawingml/2006/picture">
                   <pic:nvPicPr>
-                    <pic:cNvPr id="0" name="Picture 13"/>
+                    <pic:cNvPr id="0" name="Picture 3"/>
                     <pic:cNvPicPr>
                       <a:picLocks noChangeAspect="1" noChangeArrowheads="1"/>
                     </pic:cNvPicPr>
                   </pic:nvPicPr>
                   <pic:blipFill>
-                    <a:blip r:embed="rId12">
+                    <a:blip r:embed="rId13">
                       <a:extLst>
                         <a:ext uri="{28A0092B-C50C-407E-A947-70E740481C1C}">
                           <a14:useLocalDpi xmlns:a14="http://schemas.microsoft.com/office/drawing/2010/main" val="0"/>
@@ -1864,7 +2358,7 @@
                   <pic:spPr bwMode="auto">
                     <a:xfrm>
                       <a:off x="0" y="0"/>
-                      <a:ext cx="4344443" cy="4247122"/>
+                      <a:ext cx="3164645" cy="4546450"/>
                     </a:xfrm>
                     <a:prstGeom prst="rect">
                       <a:avLst/>
@@ -1884,6 +2378,13 @@
     <w:p>
       <w:pPr>
         <w:rPr>
+          <w:rFonts w:ascii="Times New Roman" w:eastAsia="Times New Roman" w:hAnsi="Times New Roman" w:cs="Times New Roman"/>
+        </w:rPr>
+      </w:pPr>
+    </w:p>
+    <w:p>
+      <w:pPr>
+        <w:rPr>
           <w:rFonts w:eastAsia="Times New Roman"/>
           <w:lang w:val="en-US"/>
         </w:rPr>
@@ -1924,27 +2425,52 @@
           <w:rFonts w:eastAsia="Times New Roman"/>
           <w:lang w:val="en-US"/>
         </w:rPr>
-        <w:t xml:space="preserve"> login page and home screen using React Native. I designed the user interface, added login validation, and created categories such as Set Books, Plays, Notes, and Past Papers. This improved my skills in mobile app development and UI design.</w:t>
-      </w:r>
-    </w:p>
-    <w:p>
-      <w:pPr>
-        <w:rPr>
-          <w:rFonts w:ascii="Times New Roman" w:eastAsia="Times New Roman" w:hAnsi="Times New Roman" w:cs="Times New Roman"/>
-        </w:rPr>
-      </w:pPr>
-    </w:p>
-    <w:p>
-      <w:pPr>
-        <w:rPr>
-          <w:rFonts w:ascii="Times New Roman" w:eastAsia="Times New Roman" w:hAnsi="Times New Roman" w:cs="Times New Roman"/>
-        </w:rPr>
-      </w:pPr>
-      <w:r>
-        <w:rPr>
-          <w:rFonts w:ascii="Times New Roman" w:eastAsia="Times New Roman" w:hAnsi="Times New Roman" w:cs="Times New Roman"/>
-        </w:rPr>
-        <w:lastRenderedPageBreak/>
+        <w:t xml:space="preserve"> login page</w:t>
+      </w:r>
+      <w:r>
+        <w:rPr>
+          <w:rFonts w:eastAsia="Times New Roman"/>
+          <w:lang w:val="en-US"/>
+        </w:rPr>
+        <w:t>,</w:t>
+      </w:r>
+      <w:r>
+        <w:rPr>
+          <w:rFonts w:ascii="Times New Roman" w:eastAsia="Times New Roman" w:hAnsi="Times New Roman" w:cs="Times New Roman"/>
+        </w:rPr>
+        <w:t xml:space="preserve"> </w:t>
+      </w:r>
+      <w:r>
+        <w:rPr>
+          <w:rFonts w:ascii="Times New Roman" w:eastAsia="Times New Roman" w:hAnsi="Times New Roman" w:cs="Times New Roman"/>
+        </w:rPr>
+        <w:t>Student Name, Registration Number, Course</w:t>
+      </w:r>
+      <w:r>
+        <w:rPr>
+          <w:rFonts w:eastAsia="Times New Roman"/>
+          <w:lang w:val="en-US"/>
+        </w:rPr>
+        <w:t xml:space="preserve"> and home screen using React Native. I designed the user interface, added login validation, and created categories such as Set Books, Plays, Notes, and Past Papers. This improved my skills in mobile app development and UI design.</w:t>
+      </w:r>
+    </w:p>
+    <w:p>
+      <w:pPr>
+        <w:rPr>
+          <w:rFonts w:ascii="Times New Roman" w:eastAsia="Times New Roman" w:hAnsi="Times New Roman" w:cs="Times New Roman"/>
+        </w:rPr>
+      </w:pPr>
+    </w:p>
+    <w:p>
+      <w:pPr>
+        <w:rPr>
+          <w:rFonts w:ascii="Times New Roman" w:eastAsia="Times New Roman" w:hAnsi="Times New Roman" w:cs="Times New Roman"/>
+        </w:rPr>
+      </w:pPr>
+      <w:r>
+        <w:rPr>
+          <w:rFonts w:ascii="Times New Roman" w:eastAsia="Times New Roman" w:hAnsi="Times New Roman" w:cs="Times New Roman"/>
+        </w:rPr>
         <w:t>WEEK 5 DATA MANAGEMENT</w:t>
       </w:r>
     </w:p>
@@ -1995,7 +2521,7 @@
                     </pic:cNvPicPr>
                   </pic:nvPicPr>
                   <pic:blipFill>
-                    <a:blip r:embed="rId13">
+                    <a:blip r:embed="rId14">
                       <a:extLst>
                         <a:ext uri="{28A0092B-C50C-407E-A947-70E740481C1C}">
                           <a14:useLocalDpi xmlns:a14="http://schemas.microsoft.com/office/drawing/2010/main" val="0"/>
@@ -2044,6 +2570,7 @@
         <w:rPr>
           <w:rFonts w:ascii="Times New Roman" w:eastAsia="Times New Roman" w:hAnsi="Times New Roman" w:cs="Times New Roman"/>
         </w:rPr>
+        <w:lastRenderedPageBreak/>
         <w:t xml:space="preserve"> </w:t>
       </w:r>
       <w:r>
@@ -2095,7 +2622,7 @@
                     </pic:cNvPicPr>
                   </pic:nvPicPr>
                   <pic:blipFill>
-                    <a:blip r:embed="rId14">
+                    <a:blip r:embed="rId15">
                       <a:extLst>
                         <a:ext uri="{28A0092B-C50C-407E-A947-70E740481C1C}">
                           <a14:useLocalDpi xmlns:a14="http://schemas.microsoft.com/office/drawing/2010/main" val="0"/>
@@ -2176,16 +2703,183 @@
     <w:p>
       <w:pPr>
         <w:rPr>
-          <w:rFonts w:ascii="Times New Roman" w:eastAsia="Times New Roman" w:hAnsi="Times New Roman" w:cs="Times New Roman"/>
-        </w:rPr>
-      </w:pPr>
-    </w:p>
-    <w:p>
-      <w:pPr>
-        <w:rPr>
-          <w:rFonts w:ascii="Times New Roman" w:eastAsia="Times New Roman" w:hAnsi="Times New Roman" w:cs="Times New Roman"/>
-        </w:rPr>
-      </w:pPr>
+          <w:rFonts w:eastAsia="Times New Roman"/>
+          <w:lang w:val="en-US"/>
+        </w:rPr>
+      </w:pPr>
+    </w:p>
+    <w:p>
+      <w:pPr>
+        <w:rPr>
+          <w:rFonts w:eastAsia="Times New Roman"/>
+          <w:lang w:val="en-US"/>
+        </w:rPr>
+      </w:pPr>
+      <w:r>
+        <w:rPr>
+          <w:rFonts w:eastAsia="Times New Roman"/>
+          <w:lang w:val="en-US"/>
+        </w:rPr>
+        <w:t>WEEK 6: NETWORKING AND APIs</w:t>
+      </w:r>
+    </w:p>
+    <w:p>
+      <w:pPr>
+        <w:rPr>
+          <w:rFonts w:eastAsia="Times New Roman"/>
+          <w:lang w:val="en-US"/>
+        </w:rPr>
+      </w:pPr>
+      <w:r>
+        <w:rPr>
+          <w:rFonts w:eastAsia="Times New Roman"/>
+          <w:lang w:val="en-US"/>
+        </w:rPr>
+        <w:t>Figure 3.9 Books fetched from API</w:t>
+      </w:r>
+    </w:p>
+    <w:p>
+      <w:pPr>
+        <w:rPr>
+          <w:rFonts w:eastAsia="Times New Roman"/>
+          <w:lang w:val="en-US"/>
+        </w:rPr>
+      </w:pPr>
+      <w:r>
+        <w:rPr>
+          <w:noProof/>
+        </w:rPr>
+        <w:lastRenderedPageBreak/>
+        <w:drawing>
+          <wp:inline distT="0" distB="0" distL="0" distR="0" wp14:anchorId="15E9AABA" wp14:editId="1E442D22">
+            <wp:extent cx="2660650" cy="5613400"/>
+            <wp:effectExtent l="0" t="0" r="6350" b="6350"/>
+            <wp:docPr id="241068998" name="Picture 3"/>
+            <wp:cNvGraphicFramePr>
+              <a:graphicFrameLocks xmlns:a="http://schemas.openxmlformats.org/drawingml/2006/main" noChangeAspect="1"/>
+            </wp:cNvGraphicFramePr>
+            <a:graphic xmlns:a="http://schemas.openxmlformats.org/drawingml/2006/main">
+              <a:graphicData uri="http://schemas.openxmlformats.org/drawingml/2006/picture">
+                <pic:pic xmlns:pic="http://schemas.openxmlformats.org/drawingml/2006/picture">
+                  <pic:nvPicPr>
+                    <pic:cNvPr id="0" name="Picture 5"/>
+                    <pic:cNvPicPr>
+                      <a:picLocks noChangeAspect="1" noChangeArrowheads="1"/>
+                    </pic:cNvPicPr>
+                  </pic:nvPicPr>
+                  <pic:blipFill>
+                    <a:blip r:embed="rId16" cstate="print">
+                      <a:extLst>
+                        <a:ext uri="{28A0092B-C50C-407E-A947-70E740481C1C}">
+                          <a14:useLocalDpi xmlns:a14="http://schemas.microsoft.com/office/drawing/2010/main" val="0"/>
+                        </a:ext>
+                      </a:extLst>
+                    </a:blip>
+                    <a:srcRect/>
+                    <a:stretch>
+                      <a:fillRect/>
+                    </a:stretch>
+                  </pic:blipFill>
+                  <pic:spPr bwMode="auto">
+                    <a:xfrm>
+                      <a:off x="0" y="0"/>
+                      <a:ext cx="2660650" cy="5613400"/>
+                    </a:xfrm>
+                    <a:prstGeom prst="rect">
+                      <a:avLst/>
+                    </a:prstGeom>
+                    <a:noFill/>
+                    <a:ln>
+                      <a:noFill/>
+                    </a:ln>
+                  </pic:spPr>
+                </pic:pic>
+              </a:graphicData>
+            </a:graphic>
+          </wp:inline>
+        </w:drawing>
+      </w:r>
+    </w:p>
+    <w:p>
+      <w:pPr>
+        <w:rPr>
+          <w:rFonts w:ascii="Times New Roman" w:eastAsia="Times New Roman" w:hAnsi="Times New Roman" w:cs="Times New Roman"/>
+        </w:rPr>
+      </w:pPr>
+    </w:p>
+    <w:p>
+      <w:pPr>
+        <w:rPr>
+          <w:rFonts w:ascii="Times New Roman" w:eastAsia="Times New Roman" w:hAnsi="Times New Roman" w:cs="Times New Roman"/>
+        </w:rPr>
+      </w:pPr>
+      <w:r>
+        <w:rPr>
+          <w:rFonts w:ascii="Times New Roman" w:eastAsia="Times New Roman" w:hAnsi="Times New Roman" w:cs="Times New Roman"/>
+        </w:rPr>
+        <w:t xml:space="preserve"> </w:t>
+      </w:r>
+    </w:p>
+    <w:p>
+      <w:pPr>
+        <w:rPr>
+          <w:rFonts w:ascii="Times New Roman" w:eastAsia="Times New Roman" w:hAnsi="Times New Roman" w:cs="Times New Roman"/>
+        </w:rPr>
+      </w:pPr>
+      <w:r>
+        <w:rPr>
+          <w:noProof/>
+        </w:rPr>
+        <w:lastRenderedPageBreak/>
+        <w:drawing>
+          <wp:inline distT="0" distB="0" distL="0" distR="0" wp14:anchorId="6801B734" wp14:editId="067F74D1">
+            <wp:extent cx="3009900" cy="6489700"/>
+            <wp:effectExtent l="0" t="0" r="0" b="6350"/>
+            <wp:docPr id="1345639259" name="Picture 4"/>
+            <wp:cNvGraphicFramePr>
+              <a:graphicFrameLocks xmlns:a="http://schemas.openxmlformats.org/drawingml/2006/main" noChangeAspect="1"/>
+            </wp:cNvGraphicFramePr>
+            <a:graphic xmlns:a="http://schemas.openxmlformats.org/drawingml/2006/main">
+              <a:graphicData uri="http://schemas.openxmlformats.org/drawingml/2006/picture">
+                <pic:pic xmlns:pic="http://schemas.openxmlformats.org/drawingml/2006/picture">
+                  <pic:nvPicPr>
+                    <pic:cNvPr id="0" name="Picture 7"/>
+                    <pic:cNvPicPr>
+                      <a:picLocks noChangeAspect="1" noChangeArrowheads="1"/>
+                    </pic:cNvPicPr>
+                  </pic:nvPicPr>
+                  <pic:blipFill>
+                    <a:blip r:embed="rId17">
+                      <a:extLst>
+                        <a:ext uri="{28A0092B-C50C-407E-A947-70E740481C1C}">
+                          <a14:useLocalDpi xmlns:a14="http://schemas.microsoft.com/office/drawing/2010/main" val="0"/>
+                        </a:ext>
+                      </a:extLst>
+                    </a:blip>
+                    <a:srcRect/>
+                    <a:stretch>
+                      <a:fillRect/>
+                    </a:stretch>
+                  </pic:blipFill>
+                  <pic:spPr bwMode="auto">
+                    <a:xfrm>
+                      <a:off x="0" y="0"/>
+                      <a:ext cx="3009900" cy="6489700"/>
+                    </a:xfrm>
+                    <a:prstGeom prst="rect">
+                      <a:avLst/>
+                    </a:prstGeom>
+                    <a:noFill/>
+                    <a:ln>
+                      <a:noFill/>
+                    </a:ln>
+                  </pic:spPr>
+                </pic:pic>
+              </a:graphicData>
+            </a:graphic>
+          </wp:inline>
+        </w:drawing>
+      </w:r>
     </w:p>
     <w:p>
       <w:pPr>
@@ -2725,6 +3419,7 @@
   <w:style w:type="character" w:default="1" w:styleId="DefaultParagraphFont">
     <w:name w:val="Default Paragraph Font"/>
     <w:uiPriority w:val="1"/>
+    <w:semiHidden/>
     <w:unhideWhenUsed/>
   </w:style>
   <w:style w:type="table" w:default="1" w:styleId="TableNormal">

</xml_diff>